<commit_message>
analyse results for new sites
</commit_message>
<xml_diff>
--- a/Logbook/24_10_27_logbook.docx
+++ b/Logbook/24_10_27_logbook.docx
@@ -1410,15 +1410,7 @@
         </w:numPr>
       </w:pPr>
       <w:r>
-        <w:t xml:space="preserve">Check if the folder </w:t>
-      </w:r>
-      <w:proofErr w:type="gramStart"/>
-      <w:r>
-        <w:t>exist</w:t>
-      </w:r>
-      <w:proofErr w:type="gramEnd"/>
-      <w:r>
-        <w:t xml:space="preserve"> and is matching</w:t>
+        <w:t>Check if the folder exist and is matching</w:t>
       </w:r>
     </w:p>
     <w:p>
@@ -1466,13 +1458,8 @@
         </w:numPr>
       </w:pPr>
       <w:r>
-        <w:t xml:space="preserve">Review data extraction filter and </w:t>
-      </w:r>
-      <w:proofErr w:type="spellStart"/>
-      <w:r>
-        <w:t>visualisatoin</w:t>
-      </w:r>
-      <w:proofErr w:type="spellEnd"/>
+        <w:t>Review data extraction filter and visualisatoin</w:t>
+      </w:r>
     </w:p>
     <w:p>
       <w:pPr>
@@ -1558,13 +1545,8 @@
         </w:numPr>
       </w:pPr>
       <w:r>
-        <w:t xml:space="preserve">Reopen and save on </w:t>
-      </w:r>
-      <w:proofErr w:type="spellStart"/>
-      <w:r>
-        <w:t>github</w:t>
-      </w:r>
-      <w:proofErr w:type="spellEnd"/>
+        <w:t>Reopen and save on github</w:t>
+      </w:r>
     </w:p>
     <w:p>
       <w:pPr>
@@ -1575,15 +1557,7 @@
         </w:numPr>
       </w:pPr>
       <w:r>
-        <w:t xml:space="preserve">The project it is not on </w:t>
-      </w:r>
-      <w:proofErr w:type="spellStart"/>
-      <w:r>
-        <w:t>githuhb</w:t>
-      </w:r>
-      <w:proofErr w:type="spellEnd"/>
-      <w:r>
-        <w:t>, clone it first</w:t>
+        <w:t>The project it is not on githuhb, clone it first</w:t>
       </w:r>
       <w:r>
         <w:t xml:space="preserve"> (done)</w:t>
@@ -1610,6 +1584,9 @@
         </w:numPr>
       </w:pPr>
       <w:r>
+        <w:rPr>
+          <w:noProof/>
+        </w:rPr>
         <w:lastRenderedPageBreak/>
         <w:drawing>
           <wp:inline distT="0" distB="0" distL="0" distR="0" wp14:anchorId="2635FBA7" wp14:editId="79EED433">
@@ -1672,15 +1649,7 @@
         </w:numPr>
       </w:pPr>
       <w:r>
-        <w:t xml:space="preserve">Check if the summer is the same as the </w:t>
-      </w:r>
-      <w:proofErr w:type="spellStart"/>
-      <w:r>
-        <w:t>witner</w:t>
-      </w:r>
-      <w:proofErr w:type="spellEnd"/>
-      <w:r>
-        <w:t xml:space="preserve"> through the exported data</w:t>
+        <w:t>Check if the summer is the same as the witner through the exported data</w:t>
       </w:r>
     </w:p>
     <w:p>
@@ -1692,6 +1661,9 @@
         </w:numPr>
       </w:pPr>
       <w:r>
+        <w:rPr>
+          <w:noProof/>
+        </w:rPr>
         <w:lastRenderedPageBreak/>
         <w:drawing>
           <wp:inline distT="0" distB="0" distL="0" distR="0" wp14:anchorId="398A7482" wp14:editId="4ADEE8C6">
@@ -1751,6 +1723,9 @@
         </w:numPr>
       </w:pPr>
       <w:r>
+        <w:rPr>
+          <w:noProof/>
+        </w:rPr>
         <w:lastRenderedPageBreak/>
         <w:drawing>
           <wp:inline distT="0" distB="0" distL="0" distR="0" wp14:anchorId="7EDD303C" wp14:editId="0B40611F">
@@ -1798,15 +1773,7 @@
         </w:numPr>
       </w:pPr>
       <w:r>
-        <w:t xml:space="preserve">Just the </w:t>
-      </w:r>
-      <w:proofErr w:type="spellStart"/>
-      <w:r>
-        <w:t>lable</w:t>
-      </w:r>
-      <w:proofErr w:type="spellEnd"/>
-      <w:r>
-        <w:t xml:space="preserve"> is different</w:t>
+        <w:t>Just the lable is different</w:t>
       </w:r>
     </w:p>
     <w:p>
@@ -1842,6 +1809,9 @@
         </w:numPr>
       </w:pPr>
       <w:r>
+        <w:rPr>
+          <w:noProof/>
+        </w:rPr>
         <w:drawing>
           <wp:inline distT="0" distB="0" distL="0" distR="0" wp14:anchorId="13B613D9" wp14:editId="7B1ED87C">
             <wp:extent cx="3677163" cy="962159"/>
@@ -1905,10 +1875,387 @@
     </w:p>
     <w:p>
       <w:pPr>
-        <w:pStyle w:val="ListParagraph"/>
-        <w:numPr>
-          <w:ilvl w:val="0"/>
-          <w:numId w:val="6"/>
+        <w:pStyle w:val="Heading1"/>
+      </w:pPr>
+      <w:r>
+        <w:t>25-11-01</w:t>
+      </w:r>
+    </w:p>
+    <w:p>
+      <w:pPr>
+        <w:pStyle w:val="ListParagraph"/>
+        <w:numPr>
+          <w:ilvl w:val="0"/>
+          <w:numId w:val="7"/>
+        </w:numPr>
+      </w:pPr>
+      <w:r>
+        <w:t>Analyse the new data</w:t>
+      </w:r>
+    </w:p>
+    <w:p>
+      <w:pPr>
+        <w:pStyle w:val="ListParagraph"/>
+        <w:numPr>
+          <w:ilvl w:val="1"/>
+          <w:numId w:val="7"/>
+        </w:numPr>
+      </w:pPr>
+      <w:r>
+        <w:t>Check for duplicated files, no duplication</w:t>
+      </w:r>
+    </w:p>
+    <w:p>
+      <w:pPr>
+        <w:pStyle w:val="ListParagraph"/>
+        <w:numPr>
+          <w:ilvl w:val="1"/>
+          <w:numId w:val="7"/>
+        </w:numPr>
+      </w:pPr>
+      <w:r>
+        <w:t>Check what is in the site id folder</w:t>
+      </w:r>
+    </w:p>
+    <w:p>
+      <w:pPr>
+        <w:pStyle w:val="ListParagraph"/>
+        <w:numPr>
+          <w:ilvl w:val="2"/>
+          <w:numId w:val="7"/>
+        </w:numPr>
+      </w:pPr>
+      <w:r>
+        <w:t>New</w:t>
+      </w:r>
+    </w:p>
+    <w:p>
+      <w:pPr>
+        <w:pStyle w:val="ListParagraph"/>
+        <w:numPr>
+          <w:ilvl w:val="3"/>
+          <w:numId w:val="7"/>
+        </w:numPr>
+      </w:pPr>
+      <w:r>
+        <w:t>Four season</w:t>
+      </w:r>
+    </w:p>
+    <w:p>
+      <w:pPr>
+        <w:pStyle w:val="ListParagraph"/>
+        <w:numPr>
+          <w:ilvl w:val="4"/>
+          <w:numId w:val="7"/>
+        </w:numPr>
+      </w:pPr>
+      <w:r>
+        <w:lastRenderedPageBreak/>
+        <w:t>Inverter</w:t>
+      </w:r>
+    </w:p>
+    <w:p>
+      <w:pPr>
+        <w:pStyle w:val="ListParagraph"/>
+        <w:numPr>
+          <w:ilvl w:val="4"/>
+          <w:numId w:val="7"/>
+        </w:numPr>
+      </w:pPr>
+      <w:r>
+        <w:t>Optimiser (core)</w:t>
+      </w:r>
+    </w:p>
+    <w:p>
+      <w:pPr>
+        <w:pStyle w:val="ListParagraph"/>
+        <w:numPr>
+          <w:ilvl w:val="4"/>
+          <w:numId w:val="7"/>
+        </w:numPr>
+      </w:pPr>
+      <w:r>
+        <w:t>Site daily</w:t>
+      </w:r>
+    </w:p>
+    <w:p>
+      <w:pPr>
+        <w:pStyle w:val="ListParagraph"/>
+        <w:numPr>
+          <w:ilvl w:val="3"/>
+          <w:numId w:val="7"/>
+        </w:numPr>
+      </w:pPr>
+      <w:r>
+        <w:t>Inverter meta</w:t>
+      </w:r>
+    </w:p>
+    <w:p>
+      <w:pPr>
+        <w:pStyle w:val="ListParagraph"/>
+        <w:numPr>
+          <w:ilvl w:val="3"/>
+          <w:numId w:val="7"/>
+        </w:numPr>
+      </w:pPr>
+      <w:r>
+        <w:t>Optimiser meta</w:t>
+      </w:r>
+    </w:p>
+    <w:p>
+      <w:pPr>
+        <w:pStyle w:val="ListParagraph"/>
+        <w:numPr>
+          <w:ilvl w:val="2"/>
+          <w:numId w:val="7"/>
+        </w:numPr>
+      </w:pPr>
+      <w:r>
+        <w:t>Old</w:t>
+      </w:r>
+    </w:p>
+    <w:p>
+      <w:pPr>
+        <w:pStyle w:val="ListParagraph"/>
+        <w:numPr>
+          <w:ilvl w:val="3"/>
+          <w:numId w:val="7"/>
+        </w:numPr>
+      </w:pPr>
+      <w:r>
+        <w:t>Four season</w:t>
+      </w:r>
+    </w:p>
+    <w:p>
+      <w:pPr>
+        <w:pStyle w:val="ListParagraph"/>
+        <w:numPr>
+          <w:ilvl w:val="4"/>
+          <w:numId w:val="7"/>
+        </w:numPr>
+      </w:pPr>
+      <w:r>
+        <w:t>Inverter</w:t>
+      </w:r>
+    </w:p>
+    <w:p>
+      <w:pPr>
+        <w:pStyle w:val="ListParagraph"/>
+        <w:numPr>
+          <w:ilvl w:val="4"/>
+          <w:numId w:val="7"/>
+        </w:numPr>
+      </w:pPr>
+      <w:r>
+        <w:t>Optimiser (core)</w:t>
+      </w:r>
+    </w:p>
+    <w:p>
+      <w:pPr>
+        <w:pStyle w:val="ListParagraph"/>
+        <w:numPr>
+          <w:ilvl w:val="4"/>
+          <w:numId w:val="7"/>
+        </w:numPr>
+      </w:pPr>
+      <w:r>
+        <w:t>Site daily</w:t>
+      </w:r>
+    </w:p>
+    <w:p>
+      <w:pPr>
+        <w:pStyle w:val="ListParagraph"/>
+        <w:numPr>
+          <w:ilvl w:val="3"/>
+          <w:numId w:val="7"/>
+        </w:numPr>
+      </w:pPr>
+      <w:r>
+        <w:t>Inverter meta</w:t>
+      </w:r>
+    </w:p>
+    <w:p>
+      <w:pPr>
+        <w:pStyle w:val="ListParagraph"/>
+        <w:numPr>
+          <w:ilvl w:val="3"/>
+          <w:numId w:val="7"/>
+        </w:numPr>
+      </w:pPr>
+      <w:r>
+        <w:t>Optimiser meta</w:t>
+      </w:r>
+    </w:p>
+    <w:p>
+      <w:pPr>
+        <w:pStyle w:val="ListParagraph"/>
+        <w:numPr>
+          <w:ilvl w:val="3"/>
+          <w:numId w:val="7"/>
+        </w:numPr>
+      </w:pPr>
+      <w:r>
+        <w:t>PAN file</w:t>
+      </w:r>
+    </w:p>
+    <w:p>
+      <w:pPr>
+        <w:pStyle w:val="ListParagraph"/>
+        <w:numPr>
+          <w:ilvl w:val="1"/>
+          <w:numId w:val="7"/>
+        </w:numPr>
+      </w:pPr>
+      <w:r>
+        <w:t>The new data is missing the PAN file</w:t>
+      </w:r>
+    </w:p>
+    <w:p>
+      <w:pPr>
+        <w:pStyle w:val="ListParagraph"/>
+        <w:numPr>
+          <w:ilvl w:val="1"/>
+          <w:numId w:val="7"/>
+        </w:numPr>
+      </w:pPr>
+      <w:r>
+        <w:t xml:space="preserve">Put them </w:t>
+      </w:r>
+      <w:r>
+        <w:t>manually (done)</w:t>
+      </w:r>
+    </w:p>
+    <w:p>
+      <w:pPr>
+        <w:pStyle w:val="ListParagraph"/>
+        <w:numPr>
+          <w:ilvl w:val="1"/>
+          <w:numId w:val="7"/>
+        </w:numPr>
+      </w:pPr>
+      <w:r>
+        <w:t>Check if the core excel has the same column names</w:t>
+      </w:r>
+      <w:r>
+        <w:t xml:space="preserve"> (yes)</w:t>
+      </w:r>
+    </w:p>
+    <w:p>
+      <w:pPr>
+        <w:pStyle w:val="ListParagraph"/>
+        <w:numPr>
+          <w:ilvl w:val="1"/>
+          <w:numId w:val="7"/>
+        </w:numPr>
+      </w:pPr>
+      <w:r>
+        <w:t>Look up the orientation number from Google Maps</w:t>
+      </w:r>
+    </w:p>
+    <w:p>
+      <w:pPr>
+        <w:pStyle w:val="Heading1"/>
+      </w:pPr>
+      <w:r>
+        <w:t>25-11-02</w:t>
+      </w:r>
+    </w:p>
+    <w:p>
+      <w:pPr>
+        <w:pStyle w:val="ListParagraph"/>
+        <w:numPr>
+          <w:ilvl w:val="0"/>
+          <w:numId w:val="8"/>
+        </w:numPr>
+      </w:pPr>
+      <w:r>
+        <w:t>Run the code to see if the code works</w:t>
+      </w:r>
+    </w:p>
+    <w:p>
+      <w:pPr>
+        <w:pStyle w:val="ListParagraph"/>
+        <w:numPr>
+          <w:ilvl w:val="0"/>
+          <w:numId w:val="8"/>
+        </w:numPr>
+      </w:pPr>
+      <w:r>
+        <w:t>Testing for one day for one season for one site</w:t>
+      </w:r>
+    </w:p>
+    <w:p>
+      <w:pPr>
+        <w:pStyle w:val="ListParagraph"/>
+        <w:numPr>
+          <w:ilvl w:val="0"/>
+          <w:numId w:val="8"/>
+        </w:numPr>
+      </w:pPr>
+      <w:r>
+        <w:t>Check</w:t>
+      </w:r>
+    </w:p>
+    <w:p>
+      <w:pPr>
+        <w:pStyle w:val="ListParagraph"/>
+        <w:numPr>
+          <w:ilvl w:val="1"/>
+          <w:numId w:val="8"/>
+        </w:numPr>
+      </w:pPr>
+      <w:r>
+        <w:t>What is the mismatch loss without grouping</w:t>
+      </w:r>
+      <w:r>
+        <w:t xml:space="preserve"> (worked)</w:t>
+      </w:r>
+    </w:p>
+    <w:p>
+      <w:pPr>
+        <w:pStyle w:val="ListParagraph"/>
+        <w:numPr>
+          <w:ilvl w:val="1"/>
+          <w:numId w:val="8"/>
+        </w:numPr>
+      </w:pPr>
+      <w:r>
+        <w:t>What is the mismatch loss with grouping</w:t>
+      </w:r>
+      <w:r>
+        <w:t xml:space="preserve"> (worked)</w:t>
+      </w:r>
+    </w:p>
+    <w:p>
+      <w:pPr>
+        <w:pStyle w:val="ListParagraph"/>
+        <w:numPr>
+          <w:ilvl w:val="1"/>
+          <w:numId w:val="8"/>
+        </w:numPr>
+      </w:pPr>
+      <w:r>
+        <w:t>Does the results make sense? (yes)</w:t>
+      </w:r>
+    </w:p>
+    <w:p>
+      <w:pPr>
+        <w:pStyle w:val="ListParagraph"/>
+        <w:numPr>
+          <w:ilvl w:val="0"/>
+          <w:numId w:val="8"/>
+        </w:numPr>
+      </w:pPr>
+      <w:r>
+        <w:t>If yes, run for all sites and all seasons and all days</w:t>
+      </w:r>
+    </w:p>
+    <w:p>
+      <w:pPr>
+        <w:pStyle w:val="ListParagraph"/>
+        <w:numPr>
+          <w:ilvl w:val="0"/>
+          <w:numId w:val="8"/>
         </w:numPr>
       </w:pPr>
     </w:p>
@@ -2264,6 +2611,119 @@
     </w:lvl>
   </w:abstractNum>
   <w:abstractNum w:abstractNumId="3" w15:restartNumberingAfterBreak="0">
+    <w:nsid w:val="3D54063B"/>
+    <w:multiLevelType w:val="hybridMultilevel"/>
+    <w:tmpl w:val="7B26D0B2"/>
+    <w:lvl w:ilvl="0" w:tplc="0C090001">
+      <w:start w:val="1"/>
+      <w:numFmt w:val="bullet"/>
+      <w:lvlText w:val=""/>
+      <w:lvlJc w:val="left"/>
+      <w:pPr>
+        <w:ind w:left="720" w:hanging="360"/>
+      </w:pPr>
+      <w:rPr>
+        <w:rFonts w:ascii="Symbol" w:hAnsi="Symbol" w:hint="default"/>
+      </w:rPr>
+    </w:lvl>
+    <w:lvl w:ilvl="1" w:tplc="0C090003">
+      <w:start w:val="1"/>
+      <w:numFmt w:val="bullet"/>
+      <w:lvlText w:val="o"/>
+      <w:lvlJc w:val="left"/>
+      <w:pPr>
+        <w:ind w:left="1440" w:hanging="360"/>
+      </w:pPr>
+      <w:rPr>
+        <w:rFonts w:ascii="Courier New" w:hAnsi="Courier New" w:cs="Courier New" w:hint="default"/>
+      </w:rPr>
+    </w:lvl>
+    <w:lvl w:ilvl="2" w:tplc="0C090005">
+      <w:start w:val="1"/>
+      <w:numFmt w:val="bullet"/>
+      <w:lvlText w:val=""/>
+      <w:lvlJc w:val="left"/>
+      <w:pPr>
+        <w:ind w:left="2160" w:hanging="360"/>
+      </w:pPr>
+      <w:rPr>
+        <w:rFonts w:ascii="Wingdings" w:hAnsi="Wingdings" w:hint="default"/>
+      </w:rPr>
+    </w:lvl>
+    <w:lvl w:ilvl="3" w:tplc="0C090001">
+      <w:start w:val="1"/>
+      <w:numFmt w:val="bullet"/>
+      <w:lvlText w:val=""/>
+      <w:lvlJc w:val="left"/>
+      <w:pPr>
+        <w:ind w:left="2880" w:hanging="360"/>
+      </w:pPr>
+      <w:rPr>
+        <w:rFonts w:ascii="Symbol" w:hAnsi="Symbol" w:hint="default"/>
+      </w:rPr>
+    </w:lvl>
+    <w:lvl w:ilvl="4" w:tplc="0C090003">
+      <w:start w:val="1"/>
+      <w:numFmt w:val="bullet"/>
+      <w:lvlText w:val="o"/>
+      <w:lvlJc w:val="left"/>
+      <w:pPr>
+        <w:ind w:left="3600" w:hanging="360"/>
+      </w:pPr>
+      <w:rPr>
+        <w:rFonts w:ascii="Courier New" w:hAnsi="Courier New" w:cs="Courier New" w:hint="default"/>
+      </w:rPr>
+    </w:lvl>
+    <w:lvl w:ilvl="5" w:tplc="0C090005" w:tentative="1">
+      <w:start w:val="1"/>
+      <w:numFmt w:val="bullet"/>
+      <w:lvlText w:val=""/>
+      <w:lvlJc w:val="left"/>
+      <w:pPr>
+        <w:ind w:left="4320" w:hanging="360"/>
+      </w:pPr>
+      <w:rPr>
+        <w:rFonts w:ascii="Wingdings" w:hAnsi="Wingdings" w:hint="default"/>
+      </w:rPr>
+    </w:lvl>
+    <w:lvl w:ilvl="6" w:tplc="0C090001" w:tentative="1">
+      <w:start w:val="1"/>
+      <w:numFmt w:val="bullet"/>
+      <w:lvlText w:val=""/>
+      <w:lvlJc w:val="left"/>
+      <w:pPr>
+        <w:ind w:left="5040" w:hanging="360"/>
+      </w:pPr>
+      <w:rPr>
+        <w:rFonts w:ascii="Symbol" w:hAnsi="Symbol" w:hint="default"/>
+      </w:rPr>
+    </w:lvl>
+    <w:lvl w:ilvl="7" w:tplc="0C090003" w:tentative="1">
+      <w:start w:val="1"/>
+      <w:numFmt w:val="bullet"/>
+      <w:lvlText w:val="o"/>
+      <w:lvlJc w:val="left"/>
+      <w:pPr>
+        <w:ind w:left="5760" w:hanging="360"/>
+      </w:pPr>
+      <w:rPr>
+        <w:rFonts w:ascii="Courier New" w:hAnsi="Courier New" w:cs="Courier New" w:hint="default"/>
+      </w:rPr>
+    </w:lvl>
+    <w:lvl w:ilvl="8" w:tplc="0C090005" w:tentative="1">
+      <w:start w:val="1"/>
+      <w:numFmt w:val="bullet"/>
+      <w:lvlText w:val=""/>
+      <w:lvlJc w:val="left"/>
+      <w:pPr>
+        <w:ind w:left="6480" w:hanging="360"/>
+      </w:pPr>
+      <w:rPr>
+        <w:rFonts w:ascii="Wingdings" w:hAnsi="Wingdings" w:hint="default"/>
+      </w:rPr>
+    </w:lvl>
+  </w:abstractNum>
+  <w:abstractNum w:abstractNumId="4" w15:restartNumberingAfterBreak="0">
     <w:nsid w:val="54272DB0"/>
     <w:multiLevelType w:val="hybridMultilevel"/>
     <w:tmpl w:val="00202FD8"/>
@@ -2376,7 +2836,7 @@
       </w:rPr>
     </w:lvl>
   </w:abstractNum>
-  <w:abstractNum w:abstractNumId="4" w15:restartNumberingAfterBreak="0">
+  <w:abstractNum w:abstractNumId="5" w15:restartNumberingAfterBreak="0">
     <w:nsid w:val="79324738"/>
     <w:multiLevelType w:val="hybridMultilevel"/>
     <w:tmpl w:val="EDC06E02"/>
@@ -2489,7 +2949,120 @@
       </w:rPr>
     </w:lvl>
   </w:abstractNum>
-  <w:abstractNum w:abstractNumId="5" w15:restartNumberingAfterBreak="0">
+  <w:abstractNum w:abstractNumId="6" w15:restartNumberingAfterBreak="0">
+    <w:nsid w:val="7C867CCB"/>
+    <w:multiLevelType w:val="hybridMultilevel"/>
+    <w:tmpl w:val="A6220942"/>
+    <w:lvl w:ilvl="0" w:tplc="0C090001">
+      <w:start w:val="1"/>
+      <w:numFmt w:val="bullet"/>
+      <w:lvlText w:val=""/>
+      <w:lvlJc w:val="left"/>
+      <w:pPr>
+        <w:ind w:left="720" w:hanging="360"/>
+      </w:pPr>
+      <w:rPr>
+        <w:rFonts w:ascii="Symbol" w:hAnsi="Symbol" w:hint="default"/>
+      </w:rPr>
+    </w:lvl>
+    <w:lvl w:ilvl="1" w:tplc="0C090003">
+      <w:start w:val="1"/>
+      <w:numFmt w:val="bullet"/>
+      <w:lvlText w:val="o"/>
+      <w:lvlJc w:val="left"/>
+      <w:pPr>
+        <w:ind w:left="1440" w:hanging="360"/>
+      </w:pPr>
+      <w:rPr>
+        <w:rFonts w:ascii="Courier New" w:hAnsi="Courier New" w:cs="Courier New" w:hint="default"/>
+      </w:rPr>
+    </w:lvl>
+    <w:lvl w:ilvl="2" w:tplc="0C090005" w:tentative="1">
+      <w:start w:val="1"/>
+      <w:numFmt w:val="bullet"/>
+      <w:lvlText w:val=""/>
+      <w:lvlJc w:val="left"/>
+      <w:pPr>
+        <w:ind w:left="2160" w:hanging="360"/>
+      </w:pPr>
+      <w:rPr>
+        <w:rFonts w:ascii="Wingdings" w:hAnsi="Wingdings" w:hint="default"/>
+      </w:rPr>
+    </w:lvl>
+    <w:lvl w:ilvl="3" w:tplc="0C090001" w:tentative="1">
+      <w:start w:val="1"/>
+      <w:numFmt w:val="bullet"/>
+      <w:lvlText w:val=""/>
+      <w:lvlJc w:val="left"/>
+      <w:pPr>
+        <w:ind w:left="2880" w:hanging="360"/>
+      </w:pPr>
+      <w:rPr>
+        <w:rFonts w:ascii="Symbol" w:hAnsi="Symbol" w:hint="default"/>
+      </w:rPr>
+    </w:lvl>
+    <w:lvl w:ilvl="4" w:tplc="0C090003" w:tentative="1">
+      <w:start w:val="1"/>
+      <w:numFmt w:val="bullet"/>
+      <w:lvlText w:val="o"/>
+      <w:lvlJc w:val="left"/>
+      <w:pPr>
+        <w:ind w:left="3600" w:hanging="360"/>
+      </w:pPr>
+      <w:rPr>
+        <w:rFonts w:ascii="Courier New" w:hAnsi="Courier New" w:cs="Courier New" w:hint="default"/>
+      </w:rPr>
+    </w:lvl>
+    <w:lvl w:ilvl="5" w:tplc="0C090005" w:tentative="1">
+      <w:start w:val="1"/>
+      <w:numFmt w:val="bullet"/>
+      <w:lvlText w:val=""/>
+      <w:lvlJc w:val="left"/>
+      <w:pPr>
+        <w:ind w:left="4320" w:hanging="360"/>
+      </w:pPr>
+      <w:rPr>
+        <w:rFonts w:ascii="Wingdings" w:hAnsi="Wingdings" w:hint="default"/>
+      </w:rPr>
+    </w:lvl>
+    <w:lvl w:ilvl="6" w:tplc="0C090001" w:tentative="1">
+      <w:start w:val="1"/>
+      <w:numFmt w:val="bullet"/>
+      <w:lvlText w:val=""/>
+      <w:lvlJc w:val="left"/>
+      <w:pPr>
+        <w:ind w:left="5040" w:hanging="360"/>
+      </w:pPr>
+      <w:rPr>
+        <w:rFonts w:ascii="Symbol" w:hAnsi="Symbol" w:hint="default"/>
+      </w:rPr>
+    </w:lvl>
+    <w:lvl w:ilvl="7" w:tplc="0C090003" w:tentative="1">
+      <w:start w:val="1"/>
+      <w:numFmt w:val="bullet"/>
+      <w:lvlText w:val="o"/>
+      <w:lvlJc w:val="left"/>
+      <w:pPr>
+        <w:ind w:left="5760" w:hanging="360"/>
+      </w:pPr>
+      <w:rPr>
+        <w:rFonts w:ascii="Courier New" w:hAnsi="Courier New" w:cs="Courier New" w:hint="default"/>
+      </w:rPr>
+    </w:lvl>
+    <w:lvl w:ilvl="8" w:tplc="0C090005" w:tentative="1">
+      <w:start w:val="1"/>
+      <w:numFmt w:val="bullet"/>
+      <w:lvlText w:val=""/>
+      <w:lvlJc w:val="left"/>
+      <w:pPr>
+        <w:ind w:left="6480" w:hanging="360"/>
+      </w:pPr>
+      <w:rPr>
+        <w:rFonts w:ascii="Wingdings" w:hAnsi="Wingdings" w:hint="default"/>
+      </w:rPr>
+    </w:lvl>
+  </w:abstractNum>
+  <w:abstractNum w:abstractNumId="7" w15:restartNumberingAfterBreak="0">
     <w:nsid w:val="7D6C680A"/>
     <w:multiLevelType w:val="hybridMultilevel"/>
     <w:tmpl w:val="4832142A"/>
@@ -2606,19 +3179,25 @@
     <w:abstractNumId w:val="2"/>
   </w:num>
   <w:num w:numId="2" w16cid:durableId="491215055">
-    <w:abstractNumId w:val="3"/>
+    <w:abstractNumId w:val="4"/>
   </w:num>
   <w:num w:numId="3" w16cid:durableId="1339843940">
-    <w:abstractNumId w:val="4"/>
+    <w:abstractNumId w:val="5"/>
   </w:num>
   <w:num w:numId="4" w16cid:durableId="1947956982">
     <w:abstractNumId w:val="1"/>
   </w:num>
   <w:num w:numId="5" w16cid:durableId="1841583292">
-    <w:abstractNumId w:val="5"/>
+    <w:abstractNumId w:val="7"/>
   </w:num>
   <w:num w:numId="6" w16cid:durableId="1693340824">
     <w:abstractNumId w:val="0"/>
+  </w:num>
+  <w:num w:numId="7" w16cid:durableId="2066098249">
+    <w:abstractNumId w:val="3"/>
+  </w:num>
+  <w:num w:numId="8" w16cid:durableId="213273057">
+    <w:abstractNumId w:val="6"/>
   </w:num>
 </w:numbering>
 </file>

</xml_diff>